<commit_message>
fix: Improve clarity in user manual by refining language and removing unnecessary phrases
</commit_message>
<xml_diff>
--- a/documentation/GebruikersHandleiding Skipper.docx
+++ b/documentation/GebruikersHandleiding Skipper.docx
@@ -144,6 +144,7 @@
                                           <w:szCs w:val="32"/>
                                         </w:rPr>
                                       </w:pPr>
+                                      <w:proofErr w:type="spellStart"/>
                                       <w:r>
                                         <w:rPr>
                                           <w:color w:val="FFFFFF" w:themeColor="background1"/>
@@ -152,6 +153,7 @@
                                         </w:rPr>
                                         <w:t>Periskal</w:t>
                                       </w:r>
+                                      <w:proofErr w:type="spellEnd"/>
                                     </w:p>
                                   </w:sdtContent>
                                 </w:sdt>
@@ -278,6 +280,7 @@
                                           <w:szCs w:val="108"/>
                                         </w:rPr>
                                       </w:pPr>
+                                      <w:proofErr w:type="spellStart"/>
                                       <w:r>
                                         <w:rPr>
                                           <w:rFonts w:asciiTheme="majorHAnsi" w:eastAsiaTheme="majorEastAsia" w:hAnsiTheme="majorHAnsi" w:cstheme="majorBidi"/>
@@ -285,7 +288,17 @@
                                           <w:sz w:val="108"/>
                                           <w:szCs w:val="108"/>
                                         </w:rPr>
-                                        <w:t>Periskal Academy</w:t>
+                                        <w:t>Periskal</w:t>
+                                      </w:r>
+                                      <w:proofErr w:type="spellEnd"/>
+                                      <w:r>
+                                        <w:rPr>
+                                          <w:rFonts w:asciiTheme="majorHAnsi" w:eastAsiaTheme="majorEastAsia" w:hAnsiTheme="majorHAnsi" w:cstheme="majorBidi"/>
+                                          <w:color w:val="595959" w:themeColor="text1" w:themeTint="A6"/>
+                                          <w:sz w:val="108"/>
+                                          <w:szCs w:val="108"/>
+                                        </w:rPr>
+                                        <w:t xml:space="preserve"> Academy</w:t>
                                       </w:r>
                                     </w:p>
                                   </w:sdtContent>
@@ -388,6 +401,7 @@
                                     <w:szCs w:val="32"/>
                                   </w:rPr>
                                 </w:pPr>
+                                <w:proofErr w:type="spellStart"/>
                                 <w:r>
                                   <w:rPr>
                                     <w:color w:val="FFFFFF" w:themeColor="background1"/>
@@ -396,6 +410,7 @@
                                   </w:rPr>
                                   <w:t>Periskal</w:t>
                                 </w:r>
+                                <w:proofErr w:type="spellEnd"/>
                               </w:p>
                             </w:sdtContent>
                           </w:sdt>
@@ -490,6 +505,7 @@
                                     <w:szCs w:val="108"/>
                                   </w:rPr>
                                 </w:pPr>
+                                <w:proofErr w:type="spellStart"/>
                                 <w:r>
                                   <w:rPr>
                                     <w:rFonts w:asciiTheme="majorHAnsi" w:eastAsiaTheme="majorEastAsia" w:hAnsiTheme="majorHAnsi" w:cstheme="majorBidi"/>
@@ -497,7 +513,17 @@
                                     <w:sz w:val="108"/>
                                     <w:szCs w:val="108"/>
                                   </w:rPr>
-                                  <w:t>Periskal Academy</w:t>
+                                  <w:t>Periskal</w:t>
+                                </w:r>
+                                <w:proofErr w:type="spellEnd"/>
+                                <w:r>
+                                  <w:rPr>
+                                    <w:rFonts w:asciiTheme="majorHAnsi" w:eastAsiaTheme="majorEastAsia" w:hAnsiTheme="majorHAnsi" w:cstheme="majorBidi"/>
+                                    <w:color w:val="595959" w:themeColor="text1" w:themeTint="A6"/>
+                                    <w:sz w:val="108"/>
+                                    <w:szCs w:val="108"/>
+                                  </w:rPr>
+                                  <w:t xml:space="preserve"> Academy</w:t>
                                 </w:r>
                               </w:p>
                             </w:sdtContent>
@@ -2597,7 +2623,15 @@
         <w:br/>
       </w:r>
       <w:r>
-        <w:t>Welkom bij de Periskal Academy! Deze handleiding is ontworpen om u, als Schipper, te helpen navigeren en optimaal gebruik te maken van ons online leerplatform. Hier vindt u instructies over hoe u trainingen kunt volgen, examens kunt afleggen en uw certificaten kunt beheren.</w:t>
+        <w:t xml:space="preserve">Welkom bij de </w:t>
+      </w:r>
+      <w:proofErr w:type="spellStart"/>
+      <w:r>
+        <w:t>Periskal</w:t>
+      </w:r>
+      <w:proofErr w:type="spellEnd"/>
+      <w:r>
+        <w:t xml:space="preserve"> Academy! Deze handleiding is ontworpen om u, als Schipper, te helpen navigeren en optimaal gebruik te maken van ons online leerplatform. Hier vindt u instructies over hoe u trainingen kunt volgen, examens kunt afleggen en uw certificaten kunt beheren.</w:t>
       </w:r>
     </w:p>
     <w:p/>
@@ -2620,7 +2654,15 @@
         <w:br/>
       </w:r>
       <w:r>
-        <w:t>Als Schipper gebruikt u Periskal Academy om uw kennis en vaardigheden te verbeteren door middel van online trainingen en certificeringsexamens. U kunt trainingen volgen die door uw vlootbeheerder zijn toegewezen of zelf trainingen selecteren uit de beschikbare catalogus.</w:t>
+        <w:t xml:space="preserve">Als Schipper gebruikt u </w:t>
+      </w:r>
+      <w:proofErr w:type="spellStart"/>
+      <w:r>
+        <w:t>Periskal</w:t>
+      </w:r>
+      <w:proofErr w:type="spellEnd"/>
+      <w:r>
+        <w:t xml:space="preserve"> Academy om uw kennis en vaardigheden te verbeteren door middel van online trainingen en certificeringsexamens. U kunt trainingen volgen die door uw vlootbeheerder zijn toegewezen of zelf trainingen selecteren uit de beschikbare catalogus.</w:t>
       </w:r>
     </w:p>
     <w:p/>
@@ -2729,7 +2771,15 @@
         </w:numPr>
       </w:pPr>
       <w:r>
-        <w:t>Een moderne webbrowser (bijv. Chrome, Firefox, Edge)</w:t>
+        <w:t xml:space="preserve">Een moderne webbrowser (bijv. Chrome, Firefox, </w:t>
+      </w:r>
+      <w:proofErr w:type="spellStart"/>
+      <w:r>
+        <w:t>Edge</w:t>
+      </w:r>
+      <w:proofErr w:type="spellEnd"/>
+      <w:r>
+        <w:t>)</w:t>
       </w:r>
     </w:p>
     <w:p>
@@ -2789,7 +2839,23 @@
         <w:br/>
       </w:r>
       <w:r>
-        <w:t>Toegang tot Periskal Academy als schipper verloopt via een automatische doorverwijzing vanuit een externe Periskal applicatie. U hoeft geen aparte gebruikersnaam of wachtwoord in te voeren op dit platform.</w:t>
+        <w:t xml:space="preserve">Toegang tot </w:t>
+      </w:r>
+      <w:proofErr w:type="spellStart"/>
+      <w:r>
+        <w:t>Periskal</w:t>
+      </w:r>
+      <w:proofErr w:type="spellEnd"/>
+      <w:r>
+        <w:t xml:space="preserve"> Academy als schipper verloopt via een automatische doorverwijzing vanuit een externe </w:t>
+      </w:r>
+      <w:proofErr w:type="spellStart"/>
+      <w:r>
+        <w:t>Periskal</w:t>
+      </w:r>
+      <w:proofErr w:type="spellEnd"/>
+      <w:r>
+        <w:t xml:space="preserve"> applicatie. U hoeft geen aparte gebruikersnaam of wachtwoord in te voeren op dit platform.</w:t>
       </w:r>
     </w:p>
     <w:p/>
@@ -2861,7 +2927,15 @@
         <w:t>P</w:t>
       </w:r>
       <w:r>
-        <w:t>laats uw dongle in uw systeem</w:t>
+        <w:t xml:space="preserve">laats uw </w:t>
+      </w:r>
+      <w:proofErr w:type="spellStart"/>
+      <w:r>
+        <w:t>dongle</w:t>
+      </w:r>
+      <w:proofErr w:type="spellEnd"/>
+      <w:r>
+        <w:t xml:space="preserve"> in uw systeem</w:t>
       </w:r>
       <w:r>
         <w:t>.</w:t>
@@ -2875,7 +2949,15 @@
         </w:numPr>
       </w:pPr>
       <w:r>
-        <w:t>Log in op uw gebruikelijke Periskal applicatie</w:t>
+        <w:t xml:space="preserve">Log in op uw gebruikelijke </w:t>
+      </w:r>
+      <w:proofErr w:type="spellStart"/>
+      <w:r>
+        <w:t>Periskal</w:t>
+      </w:r>
+      <w:proofErr w:type="spellEnd"/>
+      <w:r>
+        <w:t xml:space="preserve"> applicatie</w:t>
       </w:r>
       <w:r>
         <w:t>.</w:t>
@@ -2889,7 +2971,15 @@
         </w:numPr>
       </w:pPr>
       <w:r>
-        <w:t>Vanuit die applicatie wordt u automatisch doorgestuurd naar Periskal Academy</w:t>
+        <w:t xml:space="preserve">Vanuit die applicatie wordt u automatisch doorgestuurd naar </w:t>
+      </w:r>
+      <w:proofErr w:type="spellStart"/>
+      <w:r>
+        <w:t>Periskal</w:t>
+      </w:r>
+      <w:proofErr w:type="spellEnd"/>
+      <w:r>
+        <w:t xml:space="preserve"> Academy</w:t>
       </w:r>
       <w:r>
         <w:t>.</w:t>
@@ -2961,12 +3051,21 @@
       </w:pPr>
     </w:p>
     <w:p>
+      <w:proofErr w:type="spellStart"/>
       <w:r>
         <w:rPr>
           <w:b/>
           <w:bCs/>
         </w:rPr>
-        <w:t>Toegangspad:</w:t>
+        <w:t>Toegangspad</w:t>
+      </w:r>
+      <w:proofErr w:type="spellEnd"/>
+      <w:r>
+        <w:rPr>
+          <w:b/>
+          <w:bCs/>
+        </w:rPr>
+        <w:t>:</w:t>
       </w:r>
       <w:r>
         <w:br/>
@@ -2994,12 +3093,21 @@
           <w:numId w:val="39"/>
         </w:numPr>
       </w:pPr>
+      <w:proofErr w:type="spellStart"/>
       <w:r>
         <w:rPr>
           <w:b/>
           <w:bCs/>
         </w:rPr>
-        <w:t>Zijbalk (Linker Navigatiepaneel):</w:t>
+        <w:t>Zijbalk</w:t>
+      </w:r>
+      <w:proofErr w:type="spellEnd"/>
+      <w:r>
+        <w:rPr>
+          <w:b/>
+          <w:bCs/>
+        </w:rPr>
+        <w:t xml:space="preserve"> (Linker Navigatiepaneel):</w:t>
       </w:r>
       <w:r>
         <w:rPr>
@@ -3146,8 +3254,13 @@
       <w:r>
         <w:t xml:space="preserve"> Toegang tot </w:t>
       </w:r>
-      <w:r>
-        <w:t>Veelgestelde vragen</w:t>
+      <w:proofErr w:type="spellStart"/>
+      <w:r>
+        <w:t>Veelgestelde</w:t>
+      </w:r>
+      <w:proofErr w:type="spellEnd"/>
+      <w:r>
+        <w:t xml:space="preserve"> vragen</w:t>
       </w:r>
     </w:p>
     <w:p>
@@ -3201,6 +3314,7 @@
           <w:numId w:val="39"/>
         </w:numPr>
       </w:pPr>
+      <w:proofErr w:type="spellStart"/>
       <w:r>
         <w:rPr>
           <w:b/>
@@ -3208,6 +3322,7 @@
         </w:rPr>
         <w:t>Logout</w:t>
       </w:r>
+      <w:proofErr w:type="spellEnd"/>
       <w:r>
         <w:t> knop</w:t>
       </w:r>
@@ -3230,8 +3345,13 @@
         <w:t>Hoofdinhoudsgebied:</w:t>
       </w:r>
       <w:r>
-        <w:t> Toont informatie op basis van uw selectie in de zijbalk</w:t>
-      </w:r>
+        <w:t xml:space="preserve"> Toont informatie op basis van uw selectie in de </w:t>
+      </w:r>
+      <w:proofErr w:type="spellStart"/>
+      <w:r>
+        <w:t>zijbalk</w:t>
+      </w:r>
+      <w:proofErr w:type="spellEnd"/>
       <w:r>
         <w:t>.</w:t>
       </w:r>
@@ -3268,16 +3388,33 @@
     </w:p>
     <w:p/>
     <w:p>
+      <w:proofErr w:type="spellStart"/>
       <w:r>
         <w:rPr>
           <w:b/>
           <w:bCs/>
         </w:rPr>
-        <w:t>Toegangspad:</w:t>
+        <w:t>Toegangspad</w:t>
+      </w:r>
+      <w:proofErr w:type="spellEnd"/>
+      <w:r>
+        <w:rPr>
+          <w:b/>
+          <w:bCs/>
+        </w:rPr>
+        <w:t>:</w:t>
       </w:r>
       <w:r>
         <w:br/>
-        <w:t>Bevindt zich onderaan de linker zijbalk.</w:t>
+        <w:t xml:space="preserve">Bevindt zich onderaan de linker </w:t>
+      </w:r>
+      <w:proofErr w:type="spellStart"/>
+      <w:r>
+        <w:t>zijbalk</w:t>
+      </w:r>
+      <w:proofErr w:type="spellEnd"/>
+      <w:r>
+        <w:t>.</w:t>
       </w:r>
       <w:r>
         <w:t xml:space="preserve"> </w:t>
@@ -3358,14 +3495,24 @@
         </w:numPr>
       </w:pPr>
       <w:r>
-        <w:t>Zoek het taal-dropdown</w:t>
-      </w:r>
+        <w:t>Zoek het taal-</w:t>
+      </w:r>
+      <w:proofErr w:type="spellStart"/>
+      <w:r>
+        <w:t>dropdown</w:t>
+      </w:r>
+      <w:proofErr w:type="spellEnd"/>
       <w:r>
         <w:t xml:space="preserve"> </w:t>
       </w:r>
       <w:r>
-        <w:t>menu onderaan de zijbalk</w:t>
-      </w:r>
+        <w:t xml:space="preserve">menu onderaan de </w:t>
+      </w:r>
+      <w:proofErr w:type="spellStart"/>
+      <w:r>
+        <w:t>zijbalk</w:t>
+      </w:r>
+      <w:proofErr w:type="spellEnd"/>
       <w:r>
         <w:t>.</w:t>
       </w:r>
@@ -3378,8 +3525,13 @@
         </w:numPr>
       </w:pPr>
       <w:r>
-        <w:t>Klik op het dropdown</w:t>
-      </w:r>
+        <w:t xml:space="preserve">Klik op het </w:t>
+      </w:r>
+      <w:proofErr w:type="spellStart"/>
+      <w:r>
+        <w:t>dropdown</w:t>
+      </w:r>
+      <w:proofErr w:type="spellEnd"/>
       <w:r>
         <w:t xml:space="preserve"> </w:t>
       </w:r>
@@ -3452,16 +3604,33 @@
     </w:p>
     <w:p/>
     <w:p>
+      <w:proofErr w:type="spellStart"/>
       <w:r>
         <w:rPr>
           <w:b/>
           <w:bCs/>
         </w:rPr>
-        <w:t>Toegangspad:</w:t>
+        <w:t>Toegangspad</w:t>
+      </w:r>
+      <w:proofErr w:type="spellEnd"/>
+      <w:r>
+        <w:rPr>
+          <w:b/>
+          <w:bCs/>
+        </w:rPr>
+        <w:t>:</w:t>
       </w:r>
       <w:r>
         <w:br/>
-        <w:t>Bevindt zich onderaan de linker zijbalk.</w:t>
+        <w:t xml:space="preserve">Bevindt zich onderaan de linker </w:t>
+      </w:r>
+      <w:proofErr w:type="spellStart"/>
+      <w:r>
+        <w:t>zijbalk</w:t>
+      </w:r>
+      <w:proofErr w:type="spellEnd"/>
+      <w:r>
+        <w:t>.</w:t>
       </w:r>
       <w:r>
         <w:t xml:space="preserve"> </w:t>
@@ -3535,6 +3704,7 @@
       <w:r>
         <w:t>Klik op de </w:t>
       </w:r>
+      <w:proofErr w:type="spellStart"/>
       <w:r>
         <w:rPr>
           <w:b/>
@@ -3542,8 +3712,17 @@
         </w:rPr>
         <w:t>Logout</w:t>
       </w:r>
-      <w:r>
-        <w:t> knop (met een deur/pijl icoon) onderaan de zijbalk.</w:t>
+      <w:proofErr w:type="spellEnd"/>
+      <w:r>
+        <w:t xml:space="preserve"> knop (met een deur/pijl icoon) onderaan de </w:t>
+      </w:r>
+      <w:proofErr w:type="spellStart"/>
+      <w:r>
+        <w:t>zijbalk</w:t>
+      </w:r>
+      <w:proofErr w:type="spellEnd"/>
+      <w:r>
+        <w:t>.</w:t>
       </w:r>
     </w:p>
     <w:p>
@@ -3621,16 +3800,33 @@
     </w:p>
     <w:p/>
     <w:p>
+      <w:proofErr w:type="spellStart"/>
       <w:r>
         <w:rPr>
           <w:b/>
           <w:bCs/>
         </w:rPr>
-        <w:t>Toegangspad:</w:t>
+        <w:t>Toegangspad</w:t>
+      </w:r>
+      <w:proofErr w:type="spellEnd"/>
+      <w:r>
+        <w:rPr>
+          <w:b/>
+          <w:bCs/>
+        </w:rPr>
+        <w:t>:</w:t>
       </w:r>
       <w:r>
         <w:br/>
-        <w:t>Automatisch weergegeven na succesvol login, of via Zijbalk → Trainingen.</w:t>
+        <w:t xml:space="preserve">Automatisch weergegeven na succesvol login, of via </w:t>
+      </w:r>
+      <w:proofErr w:type="spellStart"/>
+      <w:r>
+        <w:t>Zijbalk</w:t>
+      </w:r>
+      <w:proofErr w:type="spellEnd"/>
+      <w:r>
+        <w:t xml:space="preserve"> → Trainingen.</w:t>
       </w:r>
     </w:p>
     <w:p/>
@@ -3673,7 +3869,13 @@
         <w:t>Doel:</w:t>
       </w:r>
       <w:r>
-        <w:t xml:space="preserve"> Om een overzicht te krijgen van alle </w:t>
+        <w:t> </w:t>
+      </w:r>
+      <w:r>
+        <w:t>E</w:t>
+      </w:r>
+      <w:r>
+        <w:t xml:space="preserve">en overzicht te krijgen van alle </w:t>
       </w:r>
       <w:r>
         <w:t>toegewezen</w:t>
@@ -3795,16 +3997,33 @@
     </w:p>
     <w:p/>
     <w:p>
+      <w:proofErr w:type="spellStart"/>
       <w:r>
         <w:rPr>
           <w:b/>
           <w:bCs/>
         </w:rPr>
-        <w:t>Toegangspad:</w:t>
+        <w:t>Toegangspad</w:t>
+      </w:r>
+      <w:proofErr w:type="spellEnd"/>
+      <w:r>
+        <w:rPr>
+          <w:b/>
+          <w:bCs/>
+        </w:rPr>
+        <w:t>:</w:t>
       </w:r>
       <w:r>
         <w:br/>
-        <w:t>Automatisch weergegeven na succesvol login, of via Zijbalk → Trainingen.</w:t>
+        <w:t xml:space="preserve">Automatisch weergegeven na succesvol login, of via </w:t>
+      </w:r>
+      <w:proofErr w:type="spellStart"/>
+      <w:r>
+        <w:t>Zijbalk</w:t>
+      </w:r>
+      <w:proofErr w:type="spellEnd"/>
+      <w:r>
+        <w:t xml:space="preserve"> → Trainingen.</w:t>
       </w:r>
     </w:p>
     <w:p/>
@@ -3848,7 +4067,13 @@
         <w:t>Doel:</w:t>
       </w:r>
       <w:r>
-        <w:t xml:space="preserve"> Om een overzicht te krijgen van alle </w:t>
+        <w:t> </w:t>
+      </w:r>
+      <w:r>
+        <w:t>E</w:t>
+      </w:r>
+      <w:r>
+        <w:t xml:space="preserve">en overzicht te krijgen van alle </w:t>
       </w:r>
       <w:r>
         <w:t>beschikba</w:t>
@@ -3979,12 +4204,21 @@
     </w:p>
     <w:p/>
     <w:p>
+      <w:proofErr w:type="spellStart"/>
       <w:r>
         <w:rPr>
           <w:b/>
           <w:bCs/>
         </w:rPr>
-        <w:t>Toegangspad:</w:t>
+        <w:t>Toegangspad</w:t>
+      </w:r>
+      <w:proofErr w:type="spellEnd"/>
+      <w:r>
+        <w:rPr>
+          <w:b/>
+          <w:bCs/>
+        </w:rPr>
+        <w:t>:</w:t>
       </w:r>
       <w:r>
         <w:br/>
@@ -4133,7 +4367,13 @@
         </w:numPr>
       </w:pPr>
       <w:r>
-        <w:t>Voor elke module: Naam, beschrijving, aantal hoofdstukken.</w:t>
+        <w:t>Voor elke module: Naam, beschrijving</w:t>
+      </w:r>
+      <w:r>
+        <w:t xml:space="preserve"> en</w:t>
+      </w:r>
+      <w:r>
+        <w:t xml:space="preserve"> aantal hoofdstukken.</w:t>
       </w:r>
     </w:p>
     <w:p>
@@ -4206,12 +4446,21 @@
     </w:p>
     <w:p/>
     <w:p>
+      <w:proofErr w:type="spellStart"/>
       <w:r>
         <w:rPr>
           <w:b/>
           <w:bCs/>
         </w:rPr>
-        <w:t>Toegangspad:</w:t>
+        <w:t>Toegangspad</w:t>
+      </w:r>
+      <w:proofErr w:type="spellEnd"/>
+      <w:r>
+        <w:rPr>
+          <w:b/>
+          <w:bCs/>
+        </w:rPr>
+        <w:t>:</w:t>
       </w:r>
       <w:r>
         <w:br/>
@@ -4530,12 +4779,21 @@
     </w:p>
     <w:p/>
     <w:p>
+      <w:proofErr w:type="spellStart"/>
       <w:r>
         <w:rPr>
           <w:b/>
           <w:bCs/>
         </w:rPr>
-        <w:t>Toegangspad:</w:t>
+        <w:t>Toegangspad</w:t>
+      </w:r>
+      <w:proofErr w:type="spellEnd"/>
+      <w:r>
+        <w:rPr>
+          <w:b/>
+          <w:bCs/>
+        </w:rPr>
+        <w:t>:</w:t>
       </w:r>
       <w:r>
         <w:br/>
@@ -4665,7 +4923,7 @@
         </w:numPr>
       </w:pPr>
       <w:r>
-        <w:t>Bedrijfsnaam (indien van toepassing)</w:t>
+        <w:t xml:space="preserve">Bedrijfsnaam </w:t>
       </w:r>
     </w:p>
     <w:p>
@@ -4687,7 +4945,7 @@
         </w:numPr>
       </w:pPr>
       <w:r>
-        <w:t>Btw-nummer (indien van toepassing)</w:t>
+        <w:t xml:space="preserve">Btw-nummer </w:t>
       </w:r>
     </w:p>
     <w:p>
@@ -4763,8 +5021,13 @@
         </w:numPr>
       </w:pPr>
       <w:r>
-        <w:t>Land (selecteer uit het dropdown</w:t>
-      </w:r>
+        <w:t xml:space="preserve">Land (selecteer uit het </w:t>
+      </w:r>
+      <w:proofErr w:type="spellStart"/>
+      <w:r>
+        <w:t>dropdown</w:t>
+      </w:r>
+      <w:proofErr w:type="spellEnd"/>
       <w:r>
         <w:t xml:space="preserve"> </w:t>
       </w:r>
@@ -4963,12 +5226,21 @@
     </w:p>
     <w:p/>
     <w:p>
+      <w:proofErr w:type="spellStart"/>
       <w:r>
         <w:rPr>
           <w:b/>
           <w:bCs/>
         </w:rPr>
-        <w:t>Toegangspad:</w:t>
+        <w:t>Toegangspad</w:t>
+      </w:r>
+      <w:proofErr w:type="spellEnd"/>
+      <w:r>
+        <w:rPr>
+          <w:b/>
+          <w:bCs/>
+        </w:rPr>
+        <w:t>:</w:t>
       </w:r>
       <w:r>
         <w:br/>
@@ -5394,7 +5666,7 @@
         </w:numPr>
       </w:pPr>
       <w:r>
-        <w:t>Indien uw nog examenpogingen over hebt kunt u het examen opnieuw proberen. Anders zullen er meer besteld moeten worden.</w:t>
+        <w:t>Indien u nog examenpogingen over hebt kunt u het examen opnieuw proberen. Anders zullen er meer besteld moeten worden.</w:t>
       </w:r>
     </w:p>
     <w:p/>
@@ -5432,18 +5704,32 @@
     </w:p>
     <w:p/>
     <w:p>
+      <w:proofErr w:type="spellStart"/>
       <w:r>
         <w:rPr>
           <w:b/>
           <w:bCs/>
         </w:rPr>
-        <w:t>Toegangspad:</w:t>
+        <w:t>Toegangspad</w:t>
+      </w:r>
+      <w:proofErr w:type="spellEnd"/>
+      <w:r>
+        <w:rPr>
+          <w:b/>
+          <w:bCs/>
+        </w:rPr>
+        <w:t>:</w:t>
       </w:r>
       <w:r>
         <w:br/>
       </w:r>
-      <w:r>
-        <w:t>Zijbalk → Certificaten</w:t>
+      <w:proofErr w:type="spellStart"/>
+      <w:r>
+        <w:t>Zijbalk</w:t>
+      </w:r>
+      <w:proofErr w:type="spellEnd"/>
+      <w:r>
+        <w:t xml:space="preserve"> → Certificaten</w:t>
       </w:r>
     </w:p>
     <w:p/>
@@ -5515,7 +5801,15 @@
         </w:numPr>
       </w:pPr>
       <w:r>
-        <w:t>Navigeer naar de "Certificaten" pagina via de zijbalk.</w:t>
+        <w:t xml:space="preserve">Navigeer naar de "Certificaten" pagina via de </w:t>
+      </w:r>
+      <w:proofErr w:type="spellStart"/>
+      <w:r>
+        <w:t>zijbalk</w:t>
+      </w:r>
+      <w:proofErr w:type="spellEnd"/>
+      <w:r>
+        <w:t>.</w:t>
       </w:r>
     </w:p>
     <w:p>
@@ -5617,18 +5911,32 @@
     </w:p>
     <w:p/>
     <w:p>
+      <w:proofErr w:type="spellStart"/>
       <w:r>
         <w:rPr>
           <w:b/>
           <w:bCs/>
         </w:rPr>
-        <w:t>Toegangspad:</w:t>
+        <w:t>Toegangspad</w:t>
+      </w:r>
+      <w:proofErr w:type="spellEnd"/>
+      <w:r>
+        <w:rPr>
+          <w:b/>
+          <w:bCs/>
+        </w:rPr>
+        <w:t>:</w:t>
       </w:r>
       <w:r>
         <w:br/>
       </w:r>
-      <w:r>
-        <w:t xml:space="preserve">Zijbalk → </w:t>
+      <w:proofErr w:type="spellStart"/>
+      <w:r>
+        <w:t>Zijbalk</w:t>
+      </w:r>
+      <w:proofErr w:type="spellEnd"/>
+      <w:r>
+        <w:t xml:space="preserve"> → </w:t>
       </w:r>
       <w:r>
         <w:t>Examens</w:t>
@@ -5829,7 +6137,15 @@
         <w:t>De</w:t>
       </w:r>
       <w:r>
-        <w:t xml:space="preserve"> FAQ-sectie biedt een verzameling antwoorden op veel gestelde vragen over het Periskal Academ</w:t>
+        <w:t xml:space="preserve"> FAQ-sectie biedt een verzameling antwoorden op veel gestelde vragen over het </w:t>
+      </w:r>
+      <w:proofErr w:type="spellStart"/>
+      <w:r>
+        <w:t>Periskal</w:t>
+      </w:r>
+      <w:proofErr w:type="spellEnd"/>
+      <w:r>
+        <w:t xml:space="preserve"> Academ</w:t>
       </w:r>
       <w:r>
         <w:t>y</w:t>
@@ -5840,12 +6156,21 @@
     </w:p>
     <w:p/>
     <w:p>
+      <w:proofErr w:type="spellStart"/>
       <w:r>
         <w:rPr>
           <w:b/>
           <w:bCs/>
         </w:rPr>
-        <w:t>Toegangspad:</w:t>
+        <w:t>Toegangspad</w:t>
+      </w:r>
+      <w:proofErr w:type="spellEnd"/>
+      <w:r>
+        <w:rPr>
+          <w:b/>
+          <w:bCs/>
+        </w:rPr>
+        <w:t>:</w:t>
       </w:r>
       <w:r>
         <w:t> </w:t>
@@ -5853,8 +6178,13 @@
       <w:r>
         <w:br/>
       </w:r>
-      <w:r>
-        <w:t xml:space="preserve">Zijbalk </w:t>
+      <w:proofErr w:type="spellStart"/>
+      <w:r>
+        <w:t>Zijbalk</w:t>
+      </w:r>
+      <w:proofErr w:type="spellEnd"/>
+      <w:r>
+        <w:t xml:space="preserve"> </w:t>
       </w:r>
       <w:r>
         <w:t>→</w:t>
@@ -5972,8 +6302,13 @@
         <w:t xml:space="preserve"> </w:t>
       </w:r>
       <w:r>
-        <w:t>in de zijbalk</w:t>
-      </w:r>
+        <w:t xml:space="preserve">in de </w:t>
+      </w:r>
+      <w:proofErr w:type="spellStart"/>
+      <w:r>
+        <w:t>zijbalk</w:t>
+      </w:r>
+      <w:proofErr w:type="spellEnd"/>
     </w:p>
     <w:p>
       <w:pPr>
@@ -6102,8 +6437,13 @@
         </w:numPr>
       </w:pPr>
       <w:r>
-        <w:t>Klik op het dropdown</w:t>
-      </w:r>
+        <w:t xml:space="preserve">Klik op het </w:t>
+      </w:r>
+      <w:proofErr w:type="spellStart"/>
+      <w:r>
+        <w:t>dropdown</w:t>
+      </w:r>
+      <w:proofErr w:type="spellEnd"/>
       <w:r>
         <w:t xml:space="preserve"> </w:t>
       </w:r>
@@ -6305,11 +6645,16 @@
         <w:t xml:space="preserve"> of</w:t>
       </w:r>
       <w:r>
-        <w:t xml:space="preserve"> Microsoft E</w:t>
+        <w:t xml:space="preserve"> Microsoft </w:t>
+      </w:r>
+      <w:proofErr w:type="spellStart"/>
+      <w:r>
+        <w:t>E</w:t>
       </w:r>
       <w:r>
         <w:t>dge</w:t>
       </w:r>
+      <w:proofErr w:type="spellEnd"/>
       <w:r>
         <w:t>.</w:t>
       </w:r>
@@ -6494,37 +6839,78 @@
           <w:b/>
           <w:bCs/>
         </w:rPr>
-        <w:t>Vlootbeheerder (FleetManager):</w:t>
-      </w:r>
-      <w:r>
-        <w:t> Een administrator verantwoordelijk voor het beheren van schippers en hun training.</w:t>
-      </w:r>
-    </w:p>
-    <w:p>
-      <w:pPr>
-        <w:ind w:left="360"/>
-      </w:pPr>
+        <w:t>Vlootbeheerder (</w:t>
+      </w:r>
+      <w:proofErr w:type="spellStart"/>
       <w:r>
         <w:rPr>
           <w:b/>
           <w:bCs/>
         </w:rPr>
-        <w:t>Modaal venster (Modal):</w:t>
-      </w:r>
-      <w:r>
-        <w:t> Een dialoogvenster/pop-upvenster dat bovenop de huidige pagina verschijnt.</w:t>
-      </w:r>
-    </w:p>
-    <w:p>
-      <w:pPr>
-        <w:ind w:left="360"/>
-      </w:pPr>
+        <w:t>FleetManager</w:t>
+      </w:r>
+      <w:proofErr w:type="spellEnd"/>
       <w:r>
         <w:rPr>
           <w:b/>
           <w:bCs/>
         </w:rPr>
-        <w:t>Dropdown menu:</w:t>
+        <w:t>):</w:t>
+      </w:r>
+      <w:r>
+        <w:t> Een administrator verantwoordelijk voor het beheren van schippers en hun training.</w:t>
+      </w:r>
+    </w:p>
+    <w:p>
+      <w:pPr>
+        <w:ind w:left="360"/>
+      </w:pPr>
+      <w:r>
+        <w:rPr>
+          <w:b/>
+          <w:bCs/>
+        </w:rPr>
+        <w:t>Modaal venster (</w:t>
+      </w:r>
+      <w:proofErr w:type="spellStart"/>
+      <w:r>
+        <w:rPr>
+          <w:b/>
+          <w:bCs/>
+        </w:rPr>
+        <w:t>Modal</w:t>
+      </w:r>
+      <w:proofErr w:type="spellEnd"/>
+      <w:r>
+        <w:rPr>
+          <w:b/>
+          <w:bCs/>
+        </w:rPr>
+        <w:t>):</w:t>
+      </w:r>
+      <w:r>
+        <w:t> Een dialoogvenster/pop-upvenster dat bovenop de huidige pagina verschijnt.</w:t>
+      </w:r>
+    </w:p>
+    <w:p>
+      <w:pPr>
+        <w:ind w:left="360"/>
+      </w:pPr>
+      <w:proofErr w:type="spellStart"/>
+      <w:r>
+        <w:rPr>
+          <w:b/>
+          <w:bCs/>
+        </w:rPr>
+        <w:t>Dropdown</w:t>
+      </w:r>
+      <w:proofErr w:type="spellEnd"/>
+      <w:r>
+        <w:rPr>
+          <w:b/>
+          <w:bCs/>
+        </w:rPr>
+        <w:t xml:space="preserve"> menu:</w:t>
       </w:r>
       <w:r>
         <w:t xml:space="preserve"> Een uitklapbaar keuzemenu waarmee gebruikers één optie kunnen selecteren uit een lijst.</w:t>
@@ -6572,7 +6958,39 @@
         <w:t>FAQ</w:t>
       </w:r>
       <w:r>
-        <w:t>: Veelgestelde Vragen (Frequently Asked Questions).</w:t>
+        <w:t>: </w:t>
+      </w:r>
+      <w:proofErr w:type="spellStart"/>
+      <w:r>
+        <w:t>Veelgestelde</w:t>
+      </w:r>
+      <w:proofErr w:type="spellEnd"/>
+      <w:r>
+        <w:t xml:space="preserve"> Vragen (</w:t>
+      </w:r>
+      <w:proofErr w:type="spellStart"/>
+      <w:r>
+        <w:t>Frequently</w:t>
+      </w:r>
+      <w:proofErr w:type="spellEnd"/>
+      <w:r>
+        <w:t xml:space="preserve"> </w:t>
+      </w:r>
+      <w:proofErr w:type="spellStart"/>
+      <w:r>
+        <w:t>Asked</w:t>
+      </w:r>
+      <w:proofErr w:type="spellEnd"/>
+      <w:r>
+        <w:t xml:space="preserve"> </w:t>
+      </w:r>
+      <w:proofErr w:type="spellStart"/>
+      <w:r>
+        <w:t>Questions</w:t>
+      </w:r>
+      <w:proofErr w:type="spellEnd"/>
+      <w:r>
+        <w:t>).</w:t>
       </w:r>
     </w:p>
     <w:p>
@@ -22193,7 +22611,6 @@
   <w:style w:type="character" w:default="1" w:styleId="Standaardalinea-lettertype">
     <w:name w:val="Default Paragraph Font"/>
     <w:uiPriority w:val="1"/>
-    <w:semiHidden/>
     <w:unhideWhenUsed/>
   </w:style>
   <w:style w:type="table" w:default="1" w:styleId="Standaardtabel">

</xml_diff>